<commit_message>
PDF FINAL CARGO CONDITION
</commit_message>
<xml_diff>
--- a/backend_api/templates/cargo_condition_template.docx
+++ b/backend_api/templates/cargo_condition_template.docx
@@ -211,13 +211,7 @@
         <w:rPr>
           <w:lang w:val="en-US"/>
         </w:rPr>
-        <w:t>{port}</w:t>
-      </w:r>
-      <w:r>
-        <w:rPr>
-          <w:lang w:val="en-US"/>
-        </w:rPr>
-        <w:t xml:space="preserve"> </w:t>
+        <w:t xml:space="preserve">{port} </w:t>
       </w:r>
       <w:r>
         <w:rPr>
@@ -477,13 +471,7 @@
         <w:rPr>
           <w:lang w:val="en-US"/>
         </w:rPr>
-        <w:t>}</w:t>
-      </w:r>
-      <w:r>
-        <w:rPr>
-          <w:lang w:val="en-US"/>
-        </w:rPr>
-        <w:t xml:space="preserve"> </w:t>
+        <w:t xml:space="preserve">} </w:t>
       </w:r>
       <w:r>
         <w:rPr>
@@ -496,13 +484,7 @@
         <w:rPr>
           <w:lang w:val="en-US"/>
         </w:rPr>
-        <w:t xml:space="preserve"> </w:t>
-      </w:r>
-      <w:r>
-        <w:rPr>
-          <w:lang w:val="en-US"/>
-        </w:rPr>
-        <w:t>{</w:t>
+        <w:t xml:space="preserve"> {</w:t>
       </w:r>
       <w:proofErr w:type="spellStart"/>
       <w:r>
@@ -516,13 +498,7 @@
         <w:rPr>
           <w:lang w:val="en-US"/>
         </w:rPr>
-        <w:t>}</w:t>
-      </w:r>
-      <w:r>
-        <w:rPr>
-          <w:lang w:val="en-US"/>
-        </w:rPr>
-        <w:t xml:space="preserve"> </w:t>
+        <w:t xml:space="preserve">} </w:t>
       </w:r>
       <w:r>
         <w:rPr>
@@ -770,6 +746,183 @@
       <w:proofErr w:type="gramEnd"/>
       <w:r>
         <w:t>chief_officer</w:t>
+      </w:r>
+      <w:proofErr w:type="spellEnd"/>
+      <w:r>
+        <w:t>}</w:t>
+      </w:r>
+    </w:p>
+    <w:p>
+      <w:pPr>
+        <w:numPr>
+          <w:ilvl w:val="0"/>
+          <w:numId w:val="1"/>
+        </w:numPr>
+        <w:spacing w:before="280"/>
+        <w:jc w:val="both"/>
+        <w:rPr>
+          <w:smallCaps/>
+          <w:szCs w:val="24"/>
+          <w:u w:val="single" w:color="3366FF"/>
+          <w:lang w:val="en-US"/>
+        </w:rPr>
+      </w:pPr>
+      <w:r>
+        <w:rPr>
+          <w:b/>
+          <w:szCs w:val="24"/>
+          <w:u w:val="single" w:color="3366FF"/>
+          <w:lang w:val="en-US"/>
+        </w:rPr>
+        <w:t>THE VESSEL</w:t>
+      </w:r>
+    </w:p>
+    <w:p>
+      <w:pPr>
+        <w:pStyle w:val="NormalJustificado"/>
+      </w:pPr>
+      <w:r>
+        <w:t>Name</w:t>
+      </w:r>
+      <w:r>
+        <w:tab/>
+      </w:r>
+      <w:r>
+        <w:tab/>
+      </w:r>
+      <w:r>
+        <w:tab/>
+      </w:r>
+      <w:r>
+        <w:tab/>
+      </w:r>
+      <w:r>
+        <w:tab/>
+      </w:r>
+      <w:r>
+        <w:t>{vessel},</w:t>
+      </w:r>
+    </w:p>
+    <w:p>
+      <w:pPr>
+        <w:pStyle w:val="NormalJustificado"/>
+      </w:pPr>
+      <w:r>
+        <w:t xml:space="preserve">Port of registry/ Flag                  </w:t>
+      </w:r>
+      <w:proofErr w:type="gramStart"/>
+      <w:r>
+        <w:t xml:space="preserve">   {</w:t>
+      </w:r>
+      <w:proofErr w:type="spellStart"/>
+      <w:proofErr w:type="gramEnd"/>
+      <w:r>
+        <w:t>vessel_port_registry_flag</w:t>
+      </w:r>
+      <w:proofErr w:type="spellEnd"/>
+      <w:r>
+        <w:t>}</w:t>
+      </w:r>
+    </w:p>
+    <w:p>
+      <w:pPr>
+        <w:pStyle w:val="NormalJustificado"/>
+      </w:pPr>
+      <w:r>
+        <w:t xml:space="preserve">GRT                                          </w:t>
+      </w:r>
+      <w:proofErr w:type="gramStart"/>
+      <w:r>
+        <w:t xml:space="preserve">   {</w:t>
+      </w:r>
+      <w:proofErr w:type="spellStart"/>
+      <w:proofErr w:type="gramEnd"/>
+      <w:r>
+        <w:rPr>
+          <w:lang w:val="es-CO"/>
+        </w:rPr>
+        <w:t>vessel_grt</w:t>
+      </w:r>
+      <w:proofErr w:type="spellEnd"/>
+      <w:r>
+        <w:rPr>
+          <w:lang w:val="es-CO"/>
+        </w:rPr>
+        <w:t>}</w:t>
+      </w:r>
+    </w:p>
+    <w:p>
+      <w:pPr>
+        <w:pStyle w:val="NormalJustificado"/>
+      </w:pPr>
+      <w:r>
+        <w:t xml:space="preserve">NRT                                          </w:t>
+      </w:r>
+      <w:proofErr w:type="gramStart"/>
+      <w:r>
+        <w:t xml:space="preserve">   {</w:t>
+      </w:r>
+      <w:proofErr w:type="spellStart"/>
+      <w:proofErr w:type="gramEnd"/>
+      <w:r>
+        <w:rPr>
+          <w:lang w:val="es-CO"/>
+        </w:rPr>
+        <w:t>vessel_nrt</w:t>
+      </w:r>
+      <w:proofErr w:type="spellEnd"/>
+      <w:r>
+        <w:rPr>
+          <w:lang w:val="es-CO"/>
+        </w:rPr>
+        <w:t>}</w:t>
+      </w:r>
+      <w:r>
+        <w:t xml:space="preserve">                                </w:t>
+      </w:r>
+    </w:p>
+    <w:p>
+      <w:pPr>
+        <w:pStyle w:val="NormalJustificado"/>
+      </w:pPr>
+      <w:r>
+        <w:t xml:space="preserve">IMO No                                     </w:t>
+      </w:r>
+      <w:proofErr w:type="gramStart"/>
+      <w:r>
+        <w:t xml:space="preserve">   {</w:t>
+      </w:r>
+      <w:proofErr w:type="spellStart"/>
+      <w:proofErr w:type="gramEnd"/>
+      <w:r>
+        <w:rPr>
+          <w:lang w:val="es-CO"/>
+        </w:rPr>
+        <w:t>vessel_imo_no</w:t>
+      </w:r>
+      <w:proofErr w:type="spellEnd"/>
+      <w:r>
+        <w:rPr>
+          <w:lang w:val="es-CO"/>
+        </w:rPr>
+        <w:t>}</w:t>
+      </w:r>
+    </w:p>
+    <w:p>
+      <w:pPr>
+        <w:pStyle w:val="NormalJustificado"/>
+      </w:pPr>
+      <w:r>
+        <w:t xml:space="preserve">Year Build                                 </w:t>
+      </w:r>
+      <w:proofErr w:type="gramStart"/>
+      <w:r>
+        <w:t xml:space="preserve">   {</w:t>
+      </w:r>
+      <w:proofErr w:type="spellStart"/>
+      <w:proofErr w:type="gramEnd"/>
+      <w:r>
+        <w:t>vessel_year_build</w:t>
       </w:r>
       <w:proofErr w:type="spellEnd"/>
       <w:r>
@@ -913,6 +1066,7 @@
         <w:rPr>
           <w:lang w:val="en-US"/>
         </w:rPr>
+        <w:lastRenderedPageBreak/>
         <w:t xml:space="preserve">N.O.R Tendered          </w:t>
       </w:r>
       <w:r>
@@ -978,13 +1132,7 @@
         <w:rPr>
           <w:lang w:val="en-US"/>
         </w:rPr>
-        <w:t>{time_1_minute}</w:t>
-      </w:r>
-      <w:r>
-        <w:rPr>
-          <w:lang w:val="en-US"/>
-        </w:rPr>
-        <w:t xml:space="preserve"> </w:t>
+        <w:t xml:space="preserve">{time_1_minute} </w:t>
       </w:r>
       <w:r>
         <w:rPr>
@@ -1313,7 +1461,6 @@
         <w:rPr>
           <w:lang w:val="en-US"/>
         </w:rPr>
-        <w:lastRenderedPageBreak/>
         <w:t>Surveyor Onboard</w:t>
       </w:r>
       <w:r>
@@ -1341,13 +1488,7 @@
         <w:rPr>
           <w:lang w:val="en-US"/>
         </w:rPr>
-        <w:t>time_5_date}</w:t>
-      </w:r>
-      <w:r>
-        <w:rPr>
-          <w:lang w:val="en-US"/>
-        </w:rPr>
-        <w:t xml:space="preserve"> </w:t>
+        <w:t xml:space="preserve">time_5_date} </w:t>
       </w:r>
       <w:r>
         <w:rPr>
@@ -1867,6 +2008,7 @@
           <w:u w:val="single" w:color="3366FF"/>
           <w:lang w:val="en-US"/>
         </w:rPr>
+        <w:lastRenderedPageBreak/>
         <w:t>SURVEY FINDINGS</w:t>
       </w:r>
     </w:p>
@@ -2330,6 +2472,7 @@
           <w:u w:color="3366FF"/>
           <w:lang w:val="es-CO"/>
         </w:rPr>
+        <w:lastRenderedPageBreak/>
         <w:t>{conclusion_2}</w:t>
       </w:r>
     </w:p>
@@ -2534,7 +2677,7 @@
           <w:lang w:val="es-ES" w:eastAsia="es-ES"/>
         </w:rPr>
         <w:drawing>
-          <wp:anchor distT="0" distB="0" distL="114300" distR="114300" simplePos="0" relativeHeight="251656192" behindDoc="1" locked="0" layoutInCell="1" allowOverlap="1" wp14:anchorId="130DD00B" wp14:editId="3B777069">
+          <wp:anchor distT="0" distB="0" distL="114300" distR="114300" simplePos="0" relativeHeight="251656192" behindDoc="1" locked="0" layoutInCell="1" allowOverlap="1" wp14:anchorId="130DD00B" wp14:editId="3327BC4F">
             <wp:simplePos x="0" y="0"/>
             <wp:positionH relativeFrom="column">
               <wp:posOffset>381000</wp:posOffset>
@@ -3162,7 +3305,15 @@
         <w:sz w:val="12"/>
         <w:lang w:val="en-US"/>
       </w:rPr>
-      <w:t>vessel}</w:t>
+      <w:t xml:space="preserve">vessel} </w:t>
+    </w:r>
+    <w:r>
+      <w:rPr>
+        <w:color w:val="000000"/>
+        <w:sz w:val="12"/>
+        <w:lang w:val="en-GB"/>
+      </w:rPr>
+      <w:t xml:space="preserve"> </w:t>
     </w:r>
     <w:r>
       <w:rPr>
@@ -3170,39 +3321,16 @@
         <w:sz w:val="12"/>
         <w:lang w:val="en-US"/>
       </w:rPr>
-      <w:t xml:space="preserve"> </w:t>
+      <w:t>{</w:t>
     </w:r>
+    <w:proofErr w:type="gramEnd"/>
     <w:r>
       <w:rPr>
         <w:color w:val="000000"/>
         <w:sz w:val="12"/>
-        <w:lang w:val="en-GB"/>
-      </w:rPr>
-      <w:t xml:space="preserve"> </w:t>
-    </w:r>
-    <w:r>
-      <w:rPr>
-        <w:color w:val="000000"/>
-        <w:sz w:val="12"/>
-      </w:rPr>
-      <w:t>{</w:t>
-    </w:r>
-    <w:proofErr w:type="spellStart"/>
-    <w:proofErr w:type="gramEnd"/>
-    <w:r>
-      <w:rPr>
-        <w:color w:val="000000"/>
-        <w:sz w:val="12"/>
-      </w:rPr>
-      <w:t>operation</w:t>
-    </w:r>
-    <w:proofErr w:type="spellEnd"/>
-    <w:r>
-      <w:rPr>
-        <w:color w:val="000000"/>
-        <w:sz w:val="12"/>
-      </w:rPr>
-      <w:t>}</w:t>
+        <w:lang w:val="en-US"/>
+      </w:rPr>
+      <w:t>operation}</w:t>
     </w:r>
     <w:r>
       <w:rPr>
@@ -6215,6 +6343,50 @@
     <w:lsdException w:name="Strong" w:qFormat="1"/>
     <w:lsdException w:name="Emphasis" w:qFormat="1"/>
     <w:lsdException w:name="Normal (Web)" w:uiPriority="99"/>
+    <w:lsdException w:name="Normal Table" w:semiHidden="1" w:unhideWhenUsed="1"/>
+    <w:lsdException w:name="Table Simple 1" w:semiHidden="1" w:unhideWhenUsed="1"/>
+    <w:lsdException w:name="Table Simple 2" w:semiHidden="1" w:unhideWhenUsed="1"/>
+    <w:lsdException w:name="Table Simple 3" w:semiHidden="1" w:unhideWhenUsed="1"/>
+    <w:lsdException w:name="Table Classic 1" w:semiHidden="1" w:unhideWhenUsed="1"/>
+    <w:lsdException w:name="Table Classic 2" w:semiHidden="1" w:unhideWhenUsed="1"/>
+    <w:lsdException w:name="Table Classic 3" w:semiHidden="1" w:unhideWhenUsed="1"/>
+    <w:lsdException w:name="Table Classic 4" w:semiHidden="1" w:unhideWhenUsed="1"/>
+    <w:lsdException w:name="Table Colorful 1" w:semiHidden="1" w:unhideWhenUsed="1"/>
+    <w:lsdException w:name="Table Colorful 2" w:semiHidden="1" w:unhideWhenUsed="1"/>
+    <w:lsdException w:name="Table Colorful 3" w:semiHidden="1" w:unhideWhenUsed="1"/>
+    <w:lsdException w:name="Table Columns 1" w:semiHidden="1" w:unhideWhenUsed="1"/>
+    <w:lsdException w:name="Table Columns 2" w:semiHidden="1" w:unhideWhenUsed="1"/>
+    <w:lsdException w:name="Table Columns 3" w:semiHidden="1" w:unhideWhenUsed="1"/>
+    <w:lsdException w:name="Table Columns 4" w:semiHidden="1" w:unhideWhenUsed="1"/>
+    <w:lsdException w:name="Table Columns 5" w:semiHidden="1" w:unhideWhenUsed="1"/>
+    <w:lsdException w:name="Table Grid 1" w:semiHidden="1" w:unhideWhenUsed="1"/>
+    <w:lsdException w:name="Table Grid 2" w:semiHidden="1" w:unhideWhenUsed="1"/>
+    <w:lsdException w:name="Table Grid 3" w:semiHidden="1" w:unhideWhenUsed="1"/>
+    <w:lsdException w:name="Table Grid 4" w:semiHidden="1" w:unhideWhenUsed="1"/>
+    <w:lsdException w:name="Table Grid 5" w:semiHidden="1" w:unhideWhenUsed="1"/>
+    <w:lsdException w:name="Table Grid 6" w:semiHidden="1" w:unhideWhenUsed="1"/>
+    <w:lsdException w:name="Table Grid 7" w:semiHidden="1" w:unhideWhenUsed="1"/>
+    <w:lsdException w:name="Table Grid 8" w:semiHidden="1" w:unhideWhenUsed="1"/>
+    <w:lsdException w:name="Table List 1" w:semiHidden="1" w:unhideWhenUsed="1"/>
+    <w:lsdException w:name="Table List 2" w:semiHidden="1" w:unhideWhenUsed="1"/>
+    <w:lsdException w:name="Table List 3" w:semiHidden="1" w:unhideWhenUsed="1"/>
+    <w:lsdException w:name="Table List 4" w:semiHidden="1" w:unhideWhenUsed="1"/>
+    <w:lsdException w:name="Table List 5" w:semiHidden="1" w:unhideWhenUsed="1"/>
+    <w:lsdException w:name="Table List 6" w:semiHidden="1" w:unhideWhenUsed="1"/>
+    <w:lsdException w:name="Table List 7" w:semiHidden="1" w:unhideWhenUsed="1"/>
+    <w:lsdException w:name="Table List 8" w:semiHidden="1" w:unhideWhenUsed="1"/>
+    <w:lsdException w:name="Table 3D effects 1" w:semiHidden="1" w:unhideWhenUsed="1"/>
+    <w:lsdException w:name="Table 3D effects 2" w:semiHidden="1" w:unhideWhenUsed="1"/>
+    <w:lsdException w:name="Table 3D effects 3" w:semiHidden="1" w:unhideWhenUsed="1"/>
+    <w:lsdException w:name="Table Contemporary" w:semiHidden="1" w:unhideWhenUsed="1"/>
+    <w:lsdException w:name="Table Elegant" w:semiHidden="1" w:unhideWhenUsed="1"/>
+    <w:lsdException w:name="Table Professional" w:semiHidden="1" w:unhideWhenUsed="1"/>
+    <w:lsdException w:name="Table Subtle 1" w:semiHidden="1" w:unhideWhenUsed="1"/>
+    <w:lsdException w:name="Table Subtle 2" w:semiHidden="1" w:unhideWhenUsed="1"/>
+    <w:lsdException w:name="Table Web 1" w:semiHidden="1" w:unhideWhenUsed="1"/>
+    <w:lsdException w:name="Table Web 2" w:semiHidden="1" w:unhideWhenUsed="1"/>
+    <w:lsdException w:name="Table Web 3" w:semiHidden="1" w:unhideWhenUsed="1"/>
+    <w:lsdException w:name="Table Theme" w:semiHidden="1" w:unhideWhenUsed="1"/>
     <w:lsdException w:name="Placeholder Text" w:semiHidden="1" w:uiPriority="99"/>
     <w:lsdException w:name="No Spacing" w:uiPriority="1" w:qFormat="1"/>
     <w:lsdException w:name="Light Shading" w:uiPriority="60"/>
@@ -6564,11 +6736,14 @@
   </w:style>
   <w:style w:type="character" w:default="1" w:styleId="DefaultParagraphFont">
     <w:name w:val="Default Paragraph Font"/>
-    <w:semiHidden/>
+    <w:uiPriority w:val="1"/>
+    <w:unhideWhenUsed/>
   </w:style>
   <w:style w:type="table" w:default="1" w:styleId="TableNormal">
     <w:name w:val="Normal Table"/>
+    <w:uiPriority w:val="99"/>
     <w:semiHidden/>
+    <w:unhideWhenUsed/>
     <w:tblPr>
       <w:tblInd w:w="0" w:type="dxa"/>
       <w:tblCellMar>
@@ -6581,7 +6756,9 @@
   </w:style>
   <w:style w:type="numbering" w:default="1" w:styleId="NoList">
     <w:name w:val="No List"/>
+    <w:uiPriority w:val="99"/>
     <w:semiHidden/>
+    <w:unhideWhenUsed/>
   </w:style>
   <w:style w:type="paragraph" w:styleId="Header">
     <w:name w:val="header"/>

</xml_diff>